<commit_message>
Broaden scope: add telecom, healthcare, e-commerce verticals across docs and site
</commit_message>
<xml_diff>
--- a/Codeward Security - Business Blueprint (EN).docx
+++ b/Codeward Security - Business Blueprint (EN).docx
@@ -75,7 +75,7 @@
           <w:sz w:val="22"/>
           <w:szCs w:val="22"/>
         </w:rPr>
-        <w:t xml:space="preserve">A Development-First Cybersecurity Practice for Fintech Platforms, Neo-Banks, Decentralized Finance, Commercial Banks &amp; Financial Regulators</w:t>
+        <w:t xml:space="preserve">A Development-First Cybersecurity Practice for Financial Services, Telecom, Healthcare, E-Commerce &amp; Technology-Driven Enterprises</w:t>
       </w:r>
     </w:p>
     <w:p>
@@ -603,7 +603,7 @@
           <w:sz w:val="23"/>
           <w:szCs w:val="23"/>
         </w:rPr>
-        <w:t xml:space="preserve">Codeward Security exists to close the gap between the velocity of modern software engineering and the uncompromising security standards demanded by global finance. We do not merely flag vulnerabilities — we sit inside the pull request, the pipeline, and the architecture review, fixing security defects at the source so that every fintech platform, neo-bank, and DeFi protocol we touch ships fast and ships safe. Founded by engineers, built for engineers, trusted by regulators.</w:t>
+        <w:t xml:space="preserve">Codeward Security exists to close the gap between the velocity of modern software engineering and the uncompromising security standards demanded by regulated, technology-driven industries. We do not merely flag vulnerabilities — we sit inside the pull request, the pipeline, and the architecture review, fixing security defects at the source so that every fintech platform, telecom carrier, healthcare system, and digital enterprise we touch ships fast and ships safe. Founded by engineers, built for engineers, trusted by regulators.</w:t>
       </w:r>
     </w:p>
     <w:p>
@@ -661,10 +661,10 @@
           <w:bCs/>
           <w:color w:val="1A1A1A"/>
         </w:rPr>
-        <w:t xml:space="preserve">Financial-domain context: </w:t>
-      </w:r>
-      <w:r>
-        <w:t xml:space="preserve">analysis models tuned to transaction logic, ledger integrity, and cryptographic key handling — not generic web-app vulnerability patterns.</w:t>
+        <w:t xml:space="preserve">Regulated-domain context: </w:t>
+      </w:r>
+      <w:r>
+        <w:t xml:space="preserve">analysis models tuned to transaction logic, data integrity, and cryptographic key handling — calibrated for fintech, healthcare, telecom, and e-commerce data flows, not generic web-app vulnerability patterns.</w:t>
       </w:r>
     </w:p>
     <w:p>
@@ -777,10 +777,10 @@
           <w:bCs/>
           <w:color w:val="1A1A1A"/>
         </w:rPr>
-        <w:t xml:space="preserve">Payment-rail specialization: </w:t>
-      </w:r>
-      <w:r>
-        <w:t xml:space="preserve">deep expertise in REST, GraphQL, and ISO 20022 / SWIFT messaging security.</w:t>
+        <w:t xml:space="preserve">Payment-rail specialization, broadly applied: </w:t>
+      </w:r>
+      <w:r>
+        <w:t xml:space="preserve">deep expertise in REST, GraphQL, and ISO 20022 / SWIFT messaging security — the same transaction-integrity discipline that secures checkout flows, billing systems, and patient-record exchanges.</w:t>
       </w:r>
     </w:p>
     <w:p>
@@ -897,6 +897,502 @@
       </w:r>
     </w:p>
     <w:p>
+      <w:pPr>
+        <w:pStyle w:val="Heading2"/>
+      </w:pPr>
+      <w:r>
+        <w:t xml:space="preserve">1.5 Industries Served</w:t>
+      </w:r>
+    </w:p>
+    <w:p>
+      <w:r>
+        <w:t xml:space="preserve">Codeward Security was founded inside financial services, and fintech remains the firm's flagship vertical — it is where the deepest regulatory expertise, competitive positioning, and proof points live. But the underlying thesis (security engineered into the SDLC, not bolted on after release) applies anywhere an organization ships production software and handles sensitive data. The practice is structured to serve adjacent regulated and technology-driven industries from day one.</w:t>
+      </w:r>
+    </w:p>
+    <w:tbl>
+      <w:tblPr>
+        <w:tblW w:type="dxa" w:w="9360"/>
+        <w:tblBorders>
+          <w:top w:val="single" w:color="D4D4D4" w:sz="2"/>
+          <w:left w:val="single" w:color="D4D4D4" w:sz="2"/>
+          <w:bottom w:val="single" w:color="D4D4D4" w:sz="2"/>
+          <w:right w:val="single" w:color="D4D4D4" w:sz="2"/>
+          <w:insideH w:val="single" w:color="D4D4D4" w:sz="2"/>
+          <w:insideV w:val="single" w:color="D4D4D4" w:sz="2"/>
+        </w:tblBorders>
+      </w:tblPr>
+      <w:tblGrid>
+        <w:gridCol w:w="2400"/>
+        <w:gridCol w:w="3760"/>
+        <w:gridCol w:w="3200"/>
+      </w:tblGrid>
+      <w:tr>
+        <w:trPr>
+          <w:tblHeader/>
+        </w:trPr>
+        <w:tc>
+          <w:tcPr>
+            <w:tcW w:type="dxa" w:w="2400"/>
+            <w:shd w:fill="1A1A1A" w:val="clear"/>
+            <w:tcMar>
+              <w:top w:type="dxa" w:w="100"/>
+              <w:left w:type="dxa" w:w="140"/>
+              <w:bottom w:type="dxa" w:w="100"/>
+              <w:right w:type="dxa" w:w="140"/>
+            </w:tcMar>
+            <w:vAlign w:val="center"/>
+          </w:tcPr>
+          <w:p>
+            <w:r>
+              <w:rPr>
+                <w:b/>
+                <w:bCs/>
+                <w:color w:val="FFFFFF"/>
+                <w:sz w:val="20"/>
+                <w:szCs w:val="20"/>
+              </w:rPr>
+              <w:t xml:space="preserve">Industry</w:t>
+            </w:r>
+          </w:p>
+        </w:tc>
+        <w:tc>
+          <w:tcPr>
+            <w:tcW w:type="dxa" w:w="3760"/>
+            <w:shd w:fill="1A1A1A" w:val="clear"/>
+            <w:tcMar>
+              <w:top w:type="dxa" w:w="100"/>
+              <w:left w:type="dxa" w:w="140"/>
+              <w:bottom w:type="dxa" w:w="100"/>
+              <w:right w:type="dxa" w:w="140"/>
+            </w:tcMar>
+            <w:vAlign w:val="center"/>
+          </w:tcPr>
+          <w:p>
+            <w:r>
+              <w:rPr>
+                <w:b/>
+                <w:bCs/>
+                <w:color w:val="FFFFFF"/>
+                <w:sz w:val="20"/>
+                <w:szCs w:val="20"/>
+              </w:rPr>
+              <w:t xml:space="preserve">Why It Fits</w:t>
+            </w:r>
+          </w:p>
+        </w:tc>
+        <w:tc>
+          <w:tcPr>
+            <w:tcW w:type="dxa" w:w="3200"/>
+            <w:shd w:fill="1A1A1A" w:val="clear"/>
+            <w:tcMar>
+              <w:top w:type="dxa" w:w="100"/>
+              <w:left w:type="dxa" w:w="140"/>
+              <w:bottom w:type="dxa" w:w="100"/>
+              <w:right w:type="dxa" w:w="140"/>
+            </w:tcMar>
+            <w:vAlign w:val="center"/>
+          </w:tcPr>
+          <w:p>
+            <w:r>
+              <w:rPr>
+                <w:b/>
+                <w:bCs/>
+                <w:color w:val="FFFFFF"/>
+                <w:sz w:val="20"/>
+                <w:szCs w:val="20"/>
+              </w:rPr>
+              <w:t xml:space="preserve">Representative Compliance Drivers</w:t>
+            </w:r>
+          </w:p>
+        </w:tc>
+      </w:tr>
+      <w:tr>
+        <w:tc>
+          <w:tcPr>
+            <w:tcW w:type="dxa" w:w="2400"/>
+            <w:shd w:fill="FFFFFF" w:val="clear"/>
+            <w:tcMar>
+              <w:top w:type="dxa" w:w="100"/>
+              <w:left w:type="dxa" w:w="140"/>
+              <w:bottom w:type="dxa" w:w="100"/>
+              <w:right w:type="dxa" w:w="140"/>
+            </w:tcMar>
+            <w:vAlign w:val="center"/>
+          </w:tcPr>
+          <w:p>
+            <w:r>
+              <w:rPr>
+                <w:b w:val="false"/>
+                <w:bCs w:val="false"/>
+                <w:color w:val="2B2B2B"/>
+                <w:sz w:val="20"/>
+                <w:szCs w:val="20"/>
+              </w:rPr>
+              <w:t xml:space="preserve">Financial Services &amp; Fintech (Flagship)</w:t>
+            </w:r>
+          </w:p>
+        </w:tc>
+        <w:tc>
+          <w:tcPr>
+            <w:tcW w:type="dxa" w:w="3760"/>
+            <w:shd w:fill="FFFFFF" w:val="clear"/>
+            <w:tcMar>
+              <w:top w:type="dxa" w:w="100"/>
+              <w:left w:type="dxa" w:w="140"/>
+              <w:bottom w:type="dxa" w:w="100"/>
+              <w:right w:type="dxa" w:w="140"/>
+            </w:tcMar>
+            <w:vAlign w:val="center"/>
+          </w:tcPr>
+          <w:p>
+            <w:r>
+              <w:rPr>
+                <w:b w:val="false"/>
+                <w:bCs w:val="false"/>
+                <w:color w:val="2B2B2B"/>
+                <w:sz w:val="20"/>
+                <w:szCs w:val="20"/>
+              </w:rPr>
+              <w:t xml:space="preserve">Payment systems, neo-banks, and DeFi protocols — the firm's founding specialization and deepest proof points.</w:t>
+            </w:r>
+          </w:p>
+        </w:tc>
+        <w:tc>
+          <w:tcPr>
+            <w:tcW w:type="dxa" w:w="3200"/>
+            <w:shd w:fill="FFFFFF" w:val="clear"/>
+            <w:tcMar>
+              <w:top w:type="dxa" w:w="100"/>
+              <w:left w:type="dxa" w:w="140"/>
+              <w:bottom w:type="dxa" w:w="100"/>
+              <w:right w:type="dxa" w:w="140"/>
+            </w:tcMar>
+            <w:vAlign w:val="center"/>
+          </w:tcPr>
+          <w:p>
+            <w:r>
+              <w:rPr>
+                <w:b w:val="false"/>
+                <w:bCs w:val="false"/>
+                <w:color w:val="2B2B2B"/>
+                <w:sz w:val="20"/>
+                <w:szCs w:val="20"/>
+              </w:rPr>
+              <w:t xml:space="preserve">PCI-DSS, SOC 2, DORA, NIS2, GLBA</w:t>
+            </w:r>
+          </w:p>
+        </w:tc>
+      </w:tr>
+      <w:tr>
+        <w:tc>
+          <w:tcPr>
+            <w:tcW w:type="dxa" w:w="2400"/>
+            <w:shd w:fill="E9E9E9" w:val="clear"/>
+            <w:tcMar>
+              <w:top w:type="dxa" w:w="100"/>
+              <w:left w:type="dxa" w:w="140"/>
+              <w:bottom w:type="dxa" w:w="100"/>
+              <w:right w:type="dxa" w:w="140"/>
+            </w:tcMar>
+            <w:vAlign w:val="center"/>
+          </w:tcPr>
+          <w:p>
+            <w:r>
+              <w:rPr>
+                <w:b w:val="false"/>
+                <w:bCs w:val="false"/>
+                <w:color w:val="2B2B2B"/>
+                <w:sz w:val="20"/>
+                <w:szCs w:val="20"/>
+              </w:rPr>
+              <w:t xml:space="preserve">Telecom &amp; Mobile Network Operators</w:t>
+            </w:r>
+          </w:p>
+        </w:tc>
+        <w:tc>
+          <w:tcPr>
+            <w:tcW w:type="dxa" w:w="3760"/>
+            <w:shd w:fill="E9E9E9" w:val="clear"/>
+            <w:tcMar>
+              <w:top w:type="dxa" w:w="100"/>
+              <w:left w:type="dxa" w:w="140"/>
+              <w:bottom w:type="dxa" w:w="100"/>
+              <w:right w:type="dxa" w:w="140"/>
+            </w:tcMar>
+            <w:vAlign w:val="center"/>
+          </w:tcPr>
+          <w:p>
+            <w:r>
+              <w:rPr>
+                <w:b w:val="false"/>
+                <w:bCs w:val="false"/>
+                <w:color w:val="2B2B2B"/>
+                <w:sz w:val="20"/>
+                <w:szCs w:val="20"/>
+              </w:rPr>
+              <w:t xml:space="preserve">Mobile money, USSD, and billing-system security for carriers and MVNOs, building directly on the firm's African mobile-money expertise.</w:t>
+            </w:r>
+          </w:p>
+        </w:tc>
+        <w:tc>
+          <w:tcPr>
+            <w:tcW w:type="dxa" w:w="3200"/>
+            <w:shd w:fill="E9E9E9" w:val="clear"/>
+            <w:tcMar>
+              <w:top w:type="dxa" w:w="100"/>
+              <w:left w:type="dxa" w:w="140"/>
+              <w:bottom w:type="dxa" w:w="100"/>
+              <w:right w:type="dxa" w:w="140"/>
+            </w:tcMar>
+            <w:vAlign w:val="center"/>
+          </w:tcPr>
+          <w:p>
+            <w:r>
+              <w:rPr>
+                <w:b w:val="false"/>
+                <w:bCs w:val="false"/>
+                <w:color w:val="2B2B2B"/>
+                <w:sz w:val="20"/>
+                <w:szCs w:val="20"/>
+              </w:rPr>
+              <w:t xml:space="preserve">NIS2 (telecom is a covered essential-entity sector), GSMA certifications, national telecom regulators</w:t>
+            </w:r>
+          </w:p>
+        </w:tc>
+      </w:tr>
+      <w:tr>
+        <w:tc>
+          <w:tcPr>
+            <w:tcW w:type="dxa" w:w="2400"/>
+            <w:shd w:fill="FFFFFF" w:val="clear"/>
+            <w:tcMar>
+              <w:top w:type="dxa" w:w="100"/>
+              <w:left w:type="dxa" w:w="140"/>
+              <w:bottom w:type="dxa" w:w="100"/>
+              <w:right w:type="dxa" w:w="140"/>
+            </w:tcMar>
+            <w:vAlign w:val="center"/>
+          </w:tcPr>
+          <w:p>
+            <w:r>
+              <w:rPr>
+                <w:b w:val="false"/>
+                <w:bCs w:val="false"/>
+                <w:color w:val="2B2B2B"/>
+                <w:sz w:val="20"/>
+                <w:szCs w:val="20"/>
+              </w:rPr>
+              <w:t xml:space="preserve">Healthcare &amp; Healthtech</w:t>
+            </w:r>
+          </w:p>
+        </w:tc>
+        <w:tc>
+          <w:tcPr>
+            <w:tcW w:type="dxa" w:w="3760"/>
+            <w:shd w:fill="FFFFFF" w:val="clear"/>
+            <w:tcMar>
+              <w:top w:type="dxa" w:w="100"/>
+              <w:left w:type="dxa" w:w="140"/>
+              <w:bottom w:type="dxa" w:w="100"/>
+              <w:right w:type="dxa" w:w="140"/>
+            </w:tcMar>
+            <w:vAlign w:val="center"/>
+          </w:tcPr>
+          <w:p>
+            <w:r>
+              <w:rPr>
+                <w:b w:val="false"/>
+                <w:bCs w:val="false"/>
+                <w:color w:val="2B2B2B"/>
+                <w:sz w:val="20"/>
+                <w:szCs w:val="20"/>
+              </w:rPr>
+              <w:t xml:space="preserve">Patient data, claims systems, and connected medical software demand the same data-integrity rigor as financial ledgers.</w:t>
+            </w:r>
+          </w:p>
+        </w:tc>
+        <w:tc>
+          <w:tcPr>
+            <w:tcW w:type="dxa" w:w="3200"/>
+            <w:shd w:fill="FFFFFF" w:val="clear"/>
+            <w:tcMar>
+              <w:top w:type="dxa" w:w="100"/>
+              <w:left w:type="dxa" w:w="140"/>
+              <w:bottom w:type="dxa" w:w="100"/>
+              <w:right w:type="dxa" w:w="140"/>
+            </w:tcMar>
+            <w:vAlign w:val="center"/>
+          </w:tcPr>
+          <w:p>
+            <w:r>
+              <w:rPr>
+                <w:b w:val="false"/>
+                <w:bCs w:val="false"/>
+                <w:color w:val="2B2B2B"/>
+                <w:sz w:val="20"/>
+                <w:szCs w:val="20"/>
+              </w:rPr>
+              <w:t xml:space="preserve">HIPAA / HITECH (U.S.), NIS2 (healthcare is also a covered essential-entity sector), regional health-data regulations</w:t>
+            </w:r>
+          </w:p>
+        </w:tc>
+      </w:tr>
+      <w:tr>
+        <w:tc>
+          <w:tcPr>
+            <w:tcW w:type="dxa" w:w="2400"/>
+            <w:shd w:fill="E9E9E9" w:val="clear"/>
+            <w:tcMar>
+              <w:top w:type="dxa" w:w="100"/>
+              <w:left w:type="dxa" w:w="140"/>
+              <w:bottom w:type="dxa" w:w="100"/>
+              <w:right w:type="dxa" w:w="140"/>
+            </w:tcMar>
+            <w:vAlign w:val="center"/>
+          </w:tcPr>
+          <w:p>
+            <w:r>
+              <w:rPr>
+                <w:b w:val="false"/>
+                <w:bCs w:val="false"/>
+                <w:color w:val="2B2B2B"/>
+                <w:sz w:val="20"/>
+                <w:szCs w:val="20"/>
+              </w:rPr>
+              <w:t xml:space="preserve">E-Commerce &amp; Retail Technology</w:t>
+            </w:r>
+          </w:p>
+        </w:tc>
+        <w:tc>
+          <w:tcPr>
+            <w:tcW w:type="dxa" w:w="3760"/>
+            <w:shd w:fill="E9E9E9" w:val="clear"/>
+            <w:tcMar>
+              <w:top w:type="dxa" w:w="100"/>
+              <w:left w:type="dxa" w:w="140"/>
+              <w:bottom w:type="dxa" w:w="100"/>
+              <w:right w:type="dxa" w:w="140"/>
+            </w:tcMar>
+            <w:vAlign w:val="center"/>
+          </w:tcPr>
+          <w:p>
+            <w:r>
+              <w:rPr>
+                <w:b w:val="false"/>
+                <w:bCs w:val="false"/>
+                <w:color w:val="2B2B2B"/>
+                <w:sz w:val="20"/>
+                <w:szCs w:val="20"/>
+              </w:rPr>
+              <w:t xml:space="preserve">Checkout flows, payment integrations, and customer data at scale share the firm's core API and transaction-layer specialization.</w:t>
+            </w:r>
+          </w:p>
+        </w:tc>
+        <w:tc>
+          <w:tcPr>
+            <w:tcW w:type="dxa" w:w="3200"/>
+            <w:shd w:fill="E9E9E9" w:val="clear"/>
+            <w:tcMar>
+              <w:top w:type="dxa" w:w="100"/>
+              <w:left w:type="dxa" w:w="140"/>
+              <w:bottom w:type="dxa" w:w="100"/>
+              <w:right w:type="dxa" w:w="140"/>
+            </w:tcMar>
+            <w:vAlign w:val="center"/>
+          </w:tcPr>
+          <w:p>
+            <w:r>
+              <w:rPr>
+                <w:b w:val="false"/>
+                <w:bCs w:val="false"/>
+                <w:color w:val="2B2B2B"/>
+                <w:sz w:val="20"/>
+                <w:szCs w:val="20"/>
+              </w:rPr>
+              <w:t xml:space="preserve">PCI-DSS, GDPR/CCPA-style consumer privacy regulations</w:t>
+            </w:r>
+          </w:p>
+        </w:tc>
+      </w:tr>
+      <w:tr>
+        <w:tc>
+          <w:tcPr>
+            <w:tcW w:type="dxa" w:w="2400"/>
+            <w:shd w:fill="FFFFFF" w:val="clear"/>
+            <w:tcMar>
+              <w:top w:type="dxa" w:w="100"/>
+              <w:left w:type="dxa" w:w="140"/>
+              <w:bottom w:type="dxa" w:w="100"/>
+              <w:right w:type="dxa" w:w="140"/>
+            </w:tcMar>
+            <w:vAlign w:val="center"/>
+          </w:tcPr>
+          <w:p>
+            <w:r>
+              <w:rPr>
+                <w:b w:val="false"/>
+                <w:bCs w:val="false"/>
+                <w:color w:val="2B2B2B"/>
+                <w:sz w:val="20"/>
+                <w:szCs w:val="20"/>
+              </w:rPr>
+              <w:t xml:space="preserve">Enterprise Technology &amp; SaaS</w:t>
+            </w:r>
+          </w:p>
+        </w:tc>
+        <w:tc>
+          <w:tcPr>
+            <w:tcW w:type="dxa" w:w="3760"/>
+            <w:shd w:fill="FFFFFF" w:val="clear"/>
+            <w:tcMar>
+              <w:top w:type="dxa" w:w="100"/>
+              <w:left w:type="dxa" w:w="140"/>
+              <w:bottom w:type="dxa" w:w="100"/>
+              <w:right w:type="dxa" w:w="140"/>
+            </w:tcMar>
+            <w:vAlign w:val="center"/>
+          </w:tcPr>
+          <w:p>
+            <w:r>
+              <w:rPr>
+                <w:b w:val="false"/>
+                <w:bCs w:val="false"/>
+                <w:color w:val="2B2B2B"/>
+                <w:sz w:val="20"/>
+                <w:szCs w:val="20"/>
+              </w:rPr>
+              <w:t xml:space="preserve">Any organization shipping production software through a real CI/CD pipeline benefits from the same engineering-embedded model.</w:t>
+            </w:r>
+          </w:p>
+        </w:tc>
+        <w:tc>
+          <w:tcPr>
+            <w:tcW w:type="dxa" w:w="3200"/>
+            <w:shd w:fill="FFFFFF" w:val="clear"/>
+            <w:tcMar>
+              <w:top w:type="dxa" w:w="100"/>
+              <w:left w:type="dxa" w:w="140"/>
+              <w:bottom w:type="dxa" w:w="100"/>
+              <w:right w:type="dxa" w:w="140"/>
+            </w:tcMar>
+            <w:vAlign w:val="center"/>
+          </w:tcPr>
+          <w:p>
+            <w:r>
+              <w:rPr>
+                <w:b w:val="false"/>
+                <w:bCs w:val="false"/>
+                <w:color w:val="2B2B2B"/>
+                <w:sz w:val="20"/>
+                <w:szCs w:val="20"/>
+              </w:rPr>
+              <w:t xml:space="preserve">SOC 2, ISO 27001</w:t>
+            </w:r>
+          </w:p>
+        </w:tc>
+      </w:tr>
+    </w:tbl>
+    <w:p>
       <w:r>
         <w:br w:type="page"/>
       </w:r>
@@ -906,12 +1402,12 @@
         <w:pStyle w:val="Heading1"/>
       </w:pPr>
       <w:r>
-        <w:t xml:space="preserve">2. Software-Centric &amp; Fintech Security Services Portfolio</w:t>
-      </w:r>
-    </w:p>
-    <w:p>
-      <w:r>
-        <w:t xml:space="preserve">The portfolio is organized around the software development lifecycle (SDLC) rather than around generic security domains — reflecting the firm's core thesis that security is a property of how software is built, not an artifact bolted on after release.</w:t>
+        <w:t xml:space="preserve">2. Software-Centric Security Services Portfolio</w:t>
+      </w:r>
+    </w:p>
+    <w:p>
+      <w:r>
+        <w:t xml:space="preserve">The portfolio is organized around the software development lifecycle (SDLC) rather than around generic security domains — reflecting the firm's core thesis that security is a property of how software is built, not an artifact bolted on after release. Service lines were proven in fintech first and are equally applicable across the firm's adjacent industries (see Section 1.5).</w:t>
       </w:r>
     </w:p>
     <w:p>
@@ -1259,24 +1755,24 @@
         <w:pStyle w:val="Heading2"/>
       </w:pPr>
       <w:r>
-        <w:t xml:space="preserve">2.5 Fintech GRC &amp; Regulatory Compliance</w:t>
-      </w:r>
-    </w:p>
-    <w:p>
-      <w:r>
-        <w:t xml:space="preserve">Compliance engineered as a byproduct of secure architecture, not a paperwork exercise bolted onto an annual audit cycle. Programs are built modularly across jurisdictions rather than templated from a single home-market framework.</w:t>
-      </w:r>
-    </w:p>
-    <w:p>
-      <w:pPr>
-        <w:pStyle w:val="ListParagraph"/>
-        <w:numPr>
-          <w:ilvl w:val="0"/>
-          <w:numId w:val="2"/>
-        </w:numPr>
-      </w:pPr>
-      <w:r>
-        <w:t xml:space="preserve">PCI-DSS v4.0 readiness assessment and gap remediation for payment card environments.</w:t>
+        <w:t xml:space="preserve">2.5 GRC &amp; Regulatory Compliance</w:t>
+      </w:r>
+    </w:p>
+    <w:p>
+      <w:r>
+        <w:t xml:space="preserve">Compliance engineered as a byproduct of secure architecture, not a paperwork exercise bolted onto an annual audit cycle. Programs are built modularly across jurisdictions and industries rather than templated from a single home-market framework.</w:t>
+      </w:r>
+    </w:p>
+    <w:p>
+      <w:pPr>
+        <w:pStyle w:val="ListParagraph"/>
+        <w:numPr>
+          <w:ilvl w:val="0"/>
+          <w:numId w:val="2"/>
+        </w:numPr>
+      </w:pPr>
+      <w:r>
+        <w:t xml:space="preserve">PCI-DSS v4.0 readiness assessment and gap remediation for payment card environments, spanning fintech and e-commerce alike.</w:t>
       </w:r>
     </w:p>
     <w:p>
@@ -1300,7 +1796,19 @@
         </w:numPr>
       </w:pPr>
       <w:r>
-        <w:t xml:space="preserve">DORA (Digital Operational Resilience Act) and NIS2 readiness for EU-regulated and EU-adjacent entities, including ICT third-party risk, Threat-Led Penetration Testing (TLPT) support, and incident-reporting frameworks.</w:t>
+        <w:t xml:space="preserve">DORA (Digital Operational Resilience Act) and NIS2 readiness for EU-regulated and EU-adjacent entities — including financial, telecom, and healthcare essential entities — with ICT third-party risk, Threat-Led Penetration Testing (TLPT) support, and incident-reporting frameworks.</w:t>
+      </w:r>
+    </w:p>
+    <w:p>
+      <w:pPr>
+        <w:pStyle w:val="ListParagraph"/>
+        <w:numPr>
+          <w:ilvl w:val="0"/>
+          <w:numId w:val="2"/>
+        </w:numPr>
+      </w:pPr>
+      <w:r>
+        <w:t xml:space="preserve">HIPAA and HITECH compliance support for healthcare and healthtech clients handling protected health information.</w:t>
       </w:r>
     </w:p>
     <w:p>
@@ -1336,7 +1844,7 @@
         </w:numPr>
       </w:pPr>
       <w:r>
-        <w:t xml:space="preserve">African data-protection and financial-sector compliance programs spanning Nigeria's NDPA and CBN cybersecurity frameworks, South Africa's POPIA, and Kenya's Data Protection Act.</w:t>
+        <w:t xml:space="preserve">African data-protection and sector-specific compliance programs spanning Nigeria's NDPA and CBN cybersecurity frameworks, South Africa's POPIA, and Kenya's Data Protection Act.</w:t>
       </w:r>
     </w:p>
     <w:p>
@@ -1446,7 +1954,7 @@
     </w:p>
     <w:p>
       <w:r>
-        <w:t xml:space="preserve">Many of the firm's banking, neo-bank, and government clients operate physical infrastructure — branches, data centers, ATM networks, and payment processing facilities — that is just as much a target as their codebases. Codeward Security extends its developer-first philosophy to the physical layer, treating cameras, access controllers, and alarm panels as networked, embedded-software-running endpoints, not just hardware.</w:t>
+        <w:t xml:space="preserve">Many of the firm's banking, healthcare, telecom, retail, and government clients operate physical infrastructure — branches, hospitals, data centers, cell sites, retail locations, and ATM networks — that is just as much a target as their codebases. Codeward Security extends its developer-first philosophy to the physical layer, treating cameras, access controllers, and alarm panels as networked, embedded-software-running endpoints, not just hardware.</w:t>
       </w:r>
     </w:p>
     <w:p>
@@ -1883,7 +2391,349 @@
         <w:pStyle w:val="Heading2"/>
       </w:pPr>
       <w:r>
-        <w:t xml:space="preserve">3.4 Segment Comparison Snapshot</w:t>
+        <w:t xml:space="preserve">3.4 Cross-Industry Application</w:t>
+      </w:r>
+    </w:p>
+    <w:p>
+      <w:r>
+        <w:t xml:space="preserve">The three archetypes above are defined by organizational maturity and risk posture, not by industry — which is exactly why they extend cleanly beyond fintech. The same engagement shape recurs in each of the firm's adjacent industries; only the regulatory backdrop changes.</w:t>
+      </w:r>
+    </w:p>
+    <w:tbl>
+      <w:tblPr>
+        <w:tblW w:type="dxa" w:w="9360"/>
+        <w:tblBorders>
+          <w:top w:val="single" w:color="D4D4D4" w:sz="2"/>
+          <w:left w:val="single" w:color="D4D4D4" w:sz="2"/>
+          <w:bottom w:val="single" w:color="D4D4D4" w:sz="2"/>
+          <w:right w:val="single" w:color="D4D4D4" w:sz="2"/>
+          <w:insideH w:val="single" w:color="D4D4D4" w:sz="2"/>
+          <w:insideV w:val="single" w:color="D4D4D4" w:sz="2"/>
+        </w:tblBorders>
+      </w:tblPr>
+      <w:tblGrid>
+        <w:gridCol w:w="2700"/>
+        <w:gridCol w:w="2700"/>
+        <w:gridCol w:w="3960"/>
+      </w:tblGrid>
+      <w:tr>
+        <w:trPr>
+          <w:tblHeader/>
+        </w:trPr>
+        <w:tc>
+          <w:tcPr>
+            <w:tcW w:type="dxa" w:w="2700"/>
+            <w:shd w:fill="1A1A1A" w:val="clear"/>
+            <w:tcMar>
+              <w:top w:type="dxa" w:w="100"/>
+              <w:left w:type="dxa" w:w="140"/>
+              <w:bottom w:type="dxa" w:w="100"/>
+              <w:right w:type="dxa" w:w="140"/>
+            </w:tcMar>
+            <w:vAlign w:val="center"/>
+          </w:tcPr>
+          <w:p>
+            <w:r>
+              <w:rPr>
+                <w:b/>
+                <w:bCs/>
+                <w:color w:val="FFFFFF"/>
+                <w:sz w:val="20"/>
+                <w:szCs w:val="20"/>
+              </w:rPr>
+              <w:t xml:space="preserve">Maturity Archetype</w:t>
+            </w:r>
+          </w:p>
+        </w:tc>
+        <w:tc>
+          <w:tcPr>
+            <w:tcW w:type="dxa" w:w="2700"/>
+            <w:shd w:fill="1A1A1A" w:val="clear"/>
+            <w:tcMar>
+              <w:top w:type="dxa" w:w="100"/>
+              <w:left w:type="dxa" w:w="140"/>
+              <w:bottom w:type="dxa" w:w="100"/>
+              <w:right w:type="dxa" w:w="140"/>
+            </w:tcMar>
+            <w:vAlign w:val="center"/>
+          </w:tcPr>
+          <w:p>
+            <w:r>
+              <w:rPr>
+                <w:b/>
+                <w:bCs/>
+                <w:color w:val="FFFFFF"/>
+                <w:sz w:val="20"/>
+                <w:szCs w:val="20"/>
+              </w:rPr>
+              <w:t xml:space="preserve">Fintech Example</w:t>
+            </w:r>
+          </w:p>
+        </w:tc>
+        <w:tc>
+          <w:tcPr>
+            <w:tcW w:type="dxa" w:w="3960"/>
+            <w:shd w:fill="1A1A1A" w:val="clear"/>
+            <w:tcMar>
+              <w:top w:type="dxa" w:w="100"/>
+              <w:left w:type="dxa" w:w="140"/>
+              <w:bottom w:type="dxa" w:w="100"/>
+              <w:right w:type="dxa" w:w="140"/>
+            </w:tcMar>
+            <w:vAlign w:val="center"/>
+          </w:tcPr>
+          <w:p>
+            <w:r>
+              <w:rPr>
+                <w:b/>
+                <w:bCs/>
+                <w:color w:val="FFFFFF"/>
+                <w:sz w:val="20"/>
+                <w:szCs w:val="20"/>
+              </w:rPr>
+              <w:t xml:space="preserve">Adjacent Industry Examples</w:t>
+            </w:r>
+          </w:p>
+        </w:tc>
+      </w:tr>
+      <w:tr>
+        <w:tc>
+          <w:tcPr>
+            <w:tcW w:type="dxa" w:w="2700"/>
+            <w:shd w:fill="FFFFFF" w:val="clear"/>
+            <w:tcMar>
+              <w:top w:type="dxa" w:w="100"/>
+              <w:left w:type="dxa" w:w="140"/>
+              <w:bottom w:type="dxa" w:w="100"/>
+              <w:right w:type="dxa" w:w="140"/>
+            </w:tcMar>
+            <w:vAlign w:val="center"/>
+          </w:tcPr>
+          <w:p>
+            <w:r>
+              <w:rPr>
+                <w:b w:val="false"/>
+                <w:bCs w:val="false"/>
+                <w:color w:val="2B2B2B"/>
+                <w:sz w:val="20"/>
+                <w:szCs w:val="20"/>
+              </w:rPr>
+              <w:t xml:space="preserve">High-Velocity Startup</w:t>
+            </w:r>
+          </w:p>
+        </w:tc>
+        <w:tc>
+          <w:tcPr>
+            <w:tcW w:type="dxa" w:w="2700"/>
+            <w:shd w:fill="FFFFFF" w:val="clear"/>
+            <w:tcMar>
+              <w:top w:type="dxa" w:w="100"/>
+              <w:left w:type="dxa" w:w="140"/>
+              <w:bottom w:type="dxa" w:w="100"/>
+              <w:right w:type="dxa" w:w="140"/>
+            </w:tcMar>
+            <w:vAlign w:val="center"/>
+          </w:tcPr>
+          <w:p>
+            <w:r>
+              <w:rPr>
+                <w:b w:val="false"/>
+                <w:bCs w:val="false"/>
+                <w:color w:val="2B2B2B"/>
+                <w:sz w:val="20"/>
+                <w:szCs w:val="20"/>
+              </w:rPr>
+              <w:t xml:space="preserve">Neo-bank, DeFi protocol</w:t>
+            </w:r>
+          </w:p>
+        </w:tc>
+        <w:tc>
+          <w:tcPr>
+            <w:tcW w:type="dxa" w:w="3960"/>
+            <w:shd w:fill="FFFFFF" w:val="clear"/>
+            <w:tcMar>
+              <w:top w:type="dxa" w:w="100"/>
+              <w:left w:type="dxa" w:w="140"/>
+              <w:bottom w:type="dxa" w:w="100"/>
+              <w:right w:type="dxa" w:w="140"/>
+            </w:tcMar>
+            <w:vAlign w:val="center"/>
+          </w:tcPr>
+          <w:p>
+            <w:r>
+              <w:rPr>
+                <w:b w:val="false"/>
+                <w:bCs w:val="false"/>
+                <w:color w:val="2B2B2B"/>
+                <w:sz w:val="20"/>
+                <w:szCs w:val="20"/>
+              </w:rPr>
+              <w:t xml:space="preserve">Healthtech startup, e-commerce platform, telecom MVNO</w:t>
+            </w:r>
+          </w:p>
+        </w:tc>
+      </w:tr>
+      <w:tr>
+        <w:tc>
+          <w:tcPr>
+            <w:tcW w:type="dxa" w:w="2700"/>
+            <w:shd w:fill="E9E9E9" w:val="clear"/>
+            <w:tcMar>
+              <w:top w:type="dxa" w:w="100"/>
+              <w:left w:type="dxa" w:w="140"/>
+              <w:bottom w:type="dxa" w:w="100"/>
+              <w:right w:type="dxa" w:w="140"/>
+            </w:tcMar>
+            <w:vAlign w:val="center"/>
+          </w:tcPr>
+          <w:p>
+            <w:r>
+              <w:rPr>
+                <w:b w:val="false"/>
+                <w:bCs w:val="false"/>
+                <w:color w:val="2B2B2B"/>
+                <w:sz w:val="20"/>
+                <w:szCs w:val="20"/>
+              </w:rPr>
+              <w:t xml:space="preserve">Established Enterprise</w:t>
+            </w:r>
+          </w:p>
+        </w:tc>
+        <w:tc>
+          <w:tcPr>
+            <w:tcW w:type="dxa" w:w="2700"/>
+            <w:shd w:fill="E9E9E9" w:val="clear"/>
+            <w:tcMar>
+              <w:top w:type="dxa" w:w="100"/>
+              <w:left w:type="dxa" w:w="140"/>
+              <w:bottom w:type="dxa" w:w="100"/>
+              <w:right w:type="dxa" w:w="140"/>
+            </w:tcMar>
+            <w:vAlign w:val="center"/>
+          </w:tcPr>
+          <w:p>
+            <w:r>
+              <w:rPr>
+                <w:b w:val="false"/>
+                <w:bCs w:val="false"/>
+                <w:color w:val="2B2B2B"/>
+                <w:sz w:val="20"/>
+                <w:szCs w:val="20"/>
+              </w:rPr>
+              <w:t xml:space="preserve">Legacy commercial bank</w:t>
+            </w:r>
+          </w:p>
+        </w:tc>
+        <w:tc>
+          <w:tcPr>
+            <w:tcW w:type="dxa" w:w="3960"/>
+            <w:shd w:fill="E9E9E9" w:val="clear"/>
+            <w:tcMar>
+              <w:top w:type="dxa" w:w="100"/>
+              <w:left w:type="dxa" w:w="140"/>
+              <w:bottom w:type="dxa" w:w="100"/>
+              <w:right w:type="dxa" w:w="140"/>
+            </w:tcMar>
+            <w:vAlign w:val="center"/>
+          </w:tcPr>
+          <w:p>
+            <w:r>
+              <w:rPr>
+                <w:b w:val="false"/>
+                <w:bCs w:val="false"/>
+                <w:color w:val="2B2B2B"/>
+                <w:sz w:val="20"/>
+                <w:szCs w:val="20"/>
+              </w:rPr>
+              <w:t xml:space="preserve">Hospital network, national telecom carrier, large retailer</w:t>
+            </w:r>
+          </w:p>
+        </w:tc>
+      </w:tr>
+      <w:tr>
+        <w:tc>
+          <w:tcPr>
+            <w:tcW w:type="dxa" w:w="2700"/>
+            <w:shd w:fill="FFFFFF" w:val="clear"/>
+            <w:tcMar>
+              <w:top w:type="dxa" w:w="100"/>
+              <w:left w:type="dxa" w:w="140"/>
+              <w:bottom w:type="dxa" w:w="100"/>
+              <w:right w:type="dxa" w:w="140"/>
+            </w:tcMar>
+            <w:vAlign w:val="center"/>
+          </w:tcPr>
+          <w:p>
+            <w:r>
+              <w:rPr>
+                <w:b w:val="false"/>
+                <w:bCs w:val="false"/>
+                <w:color w:val="2B2B2B"/>
+                <w:sz w:val="20"/>
+                <w:szCs w:val="20"/>
+              </w:rPr>
+              <w:t xml:space="preserve">Government / Regulated Body</w:t>
+            </w:r>
+          </w:p>
+        </w:tc>
+        <w:tc>
+          <w:tcPr>
+            <w:tcW w:type="dxa" w:w="2700"/>
+            <w:shd w:fill="FFFFFF" w:val="clear"/>
+            <w:tcMar>
+              <w:top w:type="dxa" w:w="100"/>
+              <w:left w:type="dxa" w:w="140"/>
+              <w:bottom w:type="dxa" w:w="100"/>
+              <w:right w:type="dxa" w:w="140"/>
+            </w:tcMar>
+            <w:vAlign w:val="center"/>
+          </w:tcPr>
+          <w:p>
+            <w:r>
+              <w:rPr>
+                <w:b w:val="false"/>
+                <w:bCs w:val="false"/>
+                <w:color w:val="2B2B2B"/>
+                <w:sz w:val="20"/>
+                <w:szCs w:val="20"/>
+              </w:rPr>
+              <w:t xml:space="preserve">Financial regulator, central bank</w:t>
+            </w:r>
+          </w:p>
+        </w:tc>
+        <w:tc>
+          <w:tcPr>
+            <w:tcW w:type="dxa" w:w="3960"/>
+            <w:shd w:fill="FFFFFF" w:val="clear"/>
+            <w:tcMar>
+              <w:top w:type="dxa" w:w="100"/>
+              <w:left w:type="dxa" w:w="140"/>
+              <w:bottom w:type="dxa" w:w="100"/>
+              <w:right w:type="dxa" w:w="140"/>
+            </w:tcMar>
+            <w:vAlign w:val="center"/>
+          </w:tcPr>
+          <w:p>
+            <w:r>
+              <w:rPr>
+                <w:b w:val="false"/>
+                <w:bCs w:val="false"/>
+                <w:color w:val="2B2B2B"/>
+                <w:sz w:val="20"/>
+                <w:szCs w:val="20"/>
+              </w:rPr>
+              <w:t xml:space="preserve">Health ministry, telecom regulator, national infrastructure authority</w:t>
+            </w:r>
+          </w:p>
+        </w:tc>
+      </w:tr>
+    </w:tbl>
+    <w:p>
+      <w:pPr>
+        <w:pStyle w:val="Heading2"/>
+      </w:pPr>
+      <w:r>
+        <w:t xml:space="preserve">3.5 Segment Comparison Snapshot</w:t>
       </w:r>
     </w:p>
     <w:tbl>
@@ -4109,7 +4959,7 @@
     </w:p>
     <w:p>
       <w:r>
-        <w:t xml:space="preserve">Tooling vendors sell software that still requires a client's own engineers to triage and fix findings; offensive-security firms and Big 4 consultancies sell expertise but typically disengage between point-in-time assessments; blockchain-only auditors are deep but narrow; physical security integrators install hardware without securing its firmware. Codeward Security occupies the white space at the intersection of all of these: a single, financially-specialized partner that ships fixes, not just findings, and stays embedded in the engineering workflow — digital and physical — between audits rather than reappearing once a year.</w:t>
+        <w:t xml:space="preserve">Tooling vendors sell software that still requires a client's own engineers to triage and fix findings; offensive-security firms and Big 4 consultancies sell expertise but typically disengage between point-in-time assessments; blockchain-only auditors are deep but narrow; physical security integrators install hardware without securing its firmware. Codeward Security occupies the white space at the intersection of all of these: a single, engineering-embedded partner — proven in fintech and extending across telecom, healthcare, e-commerce, and enterprise technology — that ships fixes, not just findings, and stays embedded in the workflow, digital and physical, between audits rather than reappearing once a year.</w:t>
       </w:r>
     </w:p>
     <w:p>
@@ -4612,7 +5462,7 @@
         <w:t xml:space="preserve">Account-based marketing: </w:t>
       </w:r>
       <w:r>
-        <w:t xml:space="preserve">targeting Series A–C fintech engineering leadership and bank technology-transformation offices across all three operating regions.</w:t>
+        <w:t xml:space="preserve">targeting Series A–C engineering leadership in fintech, telecom, healthtech, and e-commerce, plus bank and hospital-system technology-transformation offices, across all three operating regions.</w:t>
       </w:r>
     </w:p>
     <w:p>

</xml_diff>